<commit_message>
Deploy preview for PR 54 🛫
</commit_message>
<xml_diff>
--- a/pr-preview/pr-54/Your-Book-Title-tracked-changes.docx
+++ b/pr-preview/pr-54/Your-Book-Title-tracked-changes.docx
@@ -2232,7 +2232,7 @@
           <w:numId w:val="1004"/>
         </w:numPr>
       </w:pPr>
-      <w:ins w:id="79" w:author="d-morrison" w:date="2026-09-14T22:29:43Z">
+      <w:ins w:id="79" w:author="claude[bot]" w:date="2026-09-14T22:42:02Z">
         <w:r>
           <w:rPr>
             <w:b/>
@@ -2241,12 +2241,12 @@
           <w:t xml:space="preserve">Branch:</w:t>
         </w:r>
       </w:ins>
-      <w:ins w:id="79" w:author="d-morrison" w:date="2026-09-14T22:29:43Z">
+      <w:ins w:id="79" w:author="claude[bot]" w:date="2026-09-14T22:42:02Z">
         <w:r>
           <w:t xml:space="preserve"> </w:t>
         </w:r>
       </w:ins>
-      <w:ins w:id="79" w:author="d-morrison" w:date="2026-09-14T22:29:43Z">
+      <w:ins w:id="79" w:author="claude[bot]" w:date="2026-09-14T22:42:02Z">
         <w:r>
           <w:t xml:space="preserve">claude/fix-non-standard-chars</w:t>
         </w:r>
@@ -2260,7 +2260,7 @@
           <w:numId w:val="1004"/>
         </w:numPr>
       </w:pPr>
-      <w:ins w:id="80" w:author="d-morrison" w:date="2026-09-14T22:29:43Z">
+      <w:ins w:id="80" w:author="claude[bot]" w:date="2026-09-14T22:42:02Z">
         <w:r>
           <w:rPr>
             <w:b/>
@@ -2269,14 +2269,14 @@
           <w:t xml:space="preserve">Commit:</w:t>
         </w:r>
       </w:ins>
-      <w:ins w:id="80" w:author="d-morrison" w:date="2026-09-14T22:29:43Z">
+      <w:ins w:id="80" w:author="claude[bot]" w:date="2026-09-14T22:42:02Z">
         <w:r>
           <w:t xml:space="preserve"> </w:t>
         </w:r>
       </w:ins>
-      <w:ins w:id="80" w:author="d-morrison" w:date="2026-09-14T22:29:43Z">
+      <w:ins w:id="80" w:author="claude[bot]" w:date="2026-09-14T22:42:02Z">
         <w:r>
-          <w:t xml:space="preserve">12244c4</w:t>
+          <w:t xml:space="preserve">3c862ae</w:t>
         </w:r>
       </w:ins>
     </w:p>
@@ -2288,7 +2288,7 @@
           <w:numId w:val="1004"/>
         </w:numPr>
       </w:pPr>
-      <w:ins w:id="81" w:author="d-morrison" w:date="2026-09-14T22:29:43Z">
+      <w:ins w:id="81" w:author="claude[bot]" w:date="2026-09-14T22:42:02Z">
         <w:r>
           <w:rPr>
             <w:b/>
@@ -2297,14 +2297,14 @@
           <w:t xml:space="preserve">Full commit hash:</w:t>
         </w:r>
       </w:ins>
-      <w:ins w:id="81" w:author="d-morrison" w:date="2026-09-14T22:29:43Z">
+      <w:ins w:id="81" w:author="claude[bot]" w:date="2026-09-14T22:42:02Z">
         <w:r>
           <w:t xml:space="preserve"> </w:t>
         </w:r>
       </w:ins>
-      <w:ins w:id="81" w:author="d-morrison" w:date="2026-09-14T22:29:43Z">
+      <w:ins w:id="81" w:author="claude[bot]" w:date="2026-09-14T22:42:02Z">
         <w:r>
-          <w:t xml:space="preserve">12244c491d7e059a40ab7eee6763251345ba1214</w:t>
+          <w:t xml:space="preserve">3c862aeb1cbcf85a9e214b2b82a6c85936cfd550</w:t>
         </w:r>
       </w:ins>
     </w:p>
@@ -2316,7 +2316,7 @@
           <w:numId w:val="1004"/>
         </w:numPr>
       </w:pPr>
-      <w:ins w:id="82" w:author="d-morrison" w:date="2026-09-14T22:29:43Z">
+      <w:ins w:id="82" w:author="claude[bot]" w:date="2026-09-14T22:42:02Z">
         <w:r>
           <w:rPr>
             <w:b/>
@@ -2325,14 +2325,14 @@
           <w:t xml:space="preserve">Commit date:</w:t>
         </w:r>
       </w:ins>
-      <w:ins w:id="82" w:author="d-morrison" w:date="2026-09-14T22:29:43Z">
+      <w:ins w:id="82" w:author="claude[bot]" w:date="2026-09-14T22:42:02Z">
         <w:r>
           <w:t xml:space="preserve"> </w:t>
         </w:r>
       </w:ins>
-      <w:ins w:id="82" w:author="d-morrison" w:date="2026-09-14T22:29:43Z">
+      <w:ins w:id="82" w:author="claude[bot]" w:date="2026-09-14T22:42:02Z">
         <w:r>
-          <w:t xml:space="preserve">2026-09-14 15:27:22 -0700</w:t>
+          <w:t xml:space="preserve">2026-09-14 22:39:22 +0000</w:t>
         </w:r>
       </w:ins>
     </w:p>

</xml_diff>